<commit_message>
Material: Häufigkeitsdiagramm lesbar (größere Beschriftung, Akte W1·1 volle Breite)
kr_bilder.haeufigkeit: Achse 21, Buchstaben 24, Zählwerte 19, Legende 20 (viewBox 1000), Höhe 360; Akte W1·1
Archivwissen 3 zeigt das Rang-Diagramm über die volle Breite (Vorgehen darunter). Neu gebaut: Akte W1·1 und
Funkraum W1 (einzige docx mit Häufigkeitsdiagramm) samt PDFs. FACHLICHE_KORREKTUREN C20.

Co-Authored-By: Claude Opus 5.5 <noreply@anthropic.com>
Claude-Session: https://claude.ai/code/session_01JKXVQqFeKVmyQ9jfHw4db3
</commit_message>
<xml_diff>
--- a/materialien/Welt1_Bagdad/2_Akten/KR_W1_Akte1_Al-Kindis_Handschrift.docx
+++ b/materialien/Welt1_Bagdad/2_Akten/KR_W1_Akte1_Al-Kindis_Handschrift.docx
@@ -4141,370 +4141,316 @@
             </w:pPr>
             <w:r/>
           </w:p>
-          <w:tbl>
-            <w:tblPr>
-              <w:tblW w:type="dxa" w:w="9185"/>
-              <w:tblBorders>
-                <w:top w:val="nil"/>
-                <w:left w:val="nil"/>
-                <w:bottom w:val="nil"/>
-                <w:right w:val="nil"/>
-                <w:insideH w:val="nil"/>
-                <w:insideV w:val="nil"/>
-              </w:tblBorders>
-              <w:tblLayout w:type="fixed"/>
-              <w:tblLook w:firstColumn="1" w:firstRow="1" w:lastColumn="0" w:lastRow="0" w:noHBand="0" w:noVBand="1" w:val="04A0"/>
-            </w:tblPr>
-            <w:tblGrid>
-              <w:gridCol w:w="4592"/>
-              <w:gridCol w:w="4592"/>
-            </w:tblGrid>
-            <w:tr>
-              <w:tc>
-                <w:tcPr>
-                  <w:tcW w:type="dxa" w:w="4592"/>
-                  <w:tcMar>
-                    <w:top w:w="0" w:type="dxa"/>
-                    <w:start w:w="0" w:type="dxa"/>
-                    <w:bottom w:w="0" w:type="dxa"/>
-                    <w:end w:w="120" w:type="dxa"/>
-                  </w:tcMar>
-                </w:tcPr>
-                <w:p>
-                  <w:pPr>
-                    <w:spacing w:after="0"/>
-                  </w:pPr>
-                </w:p>
-                <w:p>
-                  <w:pPr>
-                    <w:spacing w:before="40" w:after="80"/>
-                    <w:jc w:val="center"/>
-                  </w:pPr>
-                  <w:r>
-                    <w:drawing>
-                      <wp:inline xmlns:a="http://schemas.openxmlformats.org/drawingml/2006/main" xmlns:pic="http://schemas.openxmlformats.org/drawingml/2006/picture">
-                        <wp:extent cx="2808000" cy="926640"/>
-                        <wp:docPr id="2" name="Picture 2"/>
-                        <wp:cNvGraphicFramePr>
-                          <a:graphicFrameLocks noChangeAspect="1"/>
-                        </wp:cNvGraphicFramePr>
-                        <a:graphic>
-                          <a:graphicData uri="http://schemas.openxmlformats.org/drawingml/2006/picture">
-                            <pic:pic>
-                              <pic:nvPicPr>
-                                <pic:cNvPr id="0" name="haeufigkeit_ad9778d2365f8de4.png"/>
-                                <pic:cNvPicPr/>
-                              </pic:nvPicPr>
-                              <pic:blipFill>
-                                <a:blip r:embed="rId10"/>
-                                <a:stretch>
-                                  <a:fillRect/>
-                                </a:stretch>
-                              </pic:blipFill>
-                              <pic:spPr>
-                                <a:xfrm>
-                                  <a:off x="0" y="0"/>
-                                  <a:ext cx="2808000" cy="926640"/>
-                                </a:xfrm>
-                                <a:prstGeom prst="rect"/>
-                              </pic:spPr>
-                            </pic:pic>
-                          </a:graphicData>
-                        </a:graphic>
-                      </wp:inline>
-                    </w:drawing>
-                  </w:r>
-                </w:p>
-              </w:tc>
-              <w:tc>
-                <w:tcPr>
-                  <w:tcW w:type="dxa" w:w="4592"/>
-                  <w:tcMar>
-                    <w:top w:w="0" w:type="dxa"/>
-                    <w:start w:w="120" w:type="dxa"/>
-                    <w:bottom w:w="0" w:type="dxa"/>
-                    <w:end w:w="0" w:type="dxa"/>
-                  </w:tcMar>
-                </w:tcPr>
-                <w:p>
-                  <w:pPr>
-                    <w:spacing w:after="0"/>
-                  </w:pPr>
-                </w:p>
-                <w:p>
-                  <w:pPr>
-                    <w:spacing w:before="0" w:after="80"/>
-                  </w:pPr>
-                  <w:r>
-                    <w:rPr>
-                      <w:rFonts w:ascii="Calibri" w:hAnsi="Calibri" w:cs="Calibri" w:eastAsia="Calibri"/>
-                      <w:b/>
-                      <w:i w:val="0"/>
-                      <w:color w:val="1B1B1F"/>
-                      <w:sz w:val="22"/>
-                    </w:rPr>
-                    <w:t>Vorgehen:</w:t>
-                  </w:r>
-                </w:p>
-                <w:p>
-                  <w:pPr>
-                    <w:tabs>
-                      <w:tab w:pos="397" w:val="left"/>
-                    </w:tabs>
-                    <w:spacing w:before="0" w:after="40"/>
-                    <w:ind w:left="397" w:hanging="283"/>
-                  </w:pPr>
-                  <w:r>
-                    <w:rPr>
-                      <w:rFonts w:ascii="Calibri" w:hAnsi="Calibri" w:cs="Calibri" w:eastAsia="Calibri"/>
-                      <w:b/>
-                      <w:color w:val="14213D"/>
-                      <w:sz w:val="22"/>
-                    </w:rPr>
-                    <w:t>1.</w:t>
-                    <w:tab/>
-                  </w:r>
-                  <w:r>
-                    <w:rPr>
-                      <w:rFonts w:ascii="Calibri" w:hAnsi="Calibri" w:cs="Calibri" w:eastAsia="Calibri"/>
-                      <w:b w:val="0"/>
-                      <w:i w:val="0"/>
-                      <w:color w:val="1B1B1F"/>
-                      <w:sz w:val="22"/>
-                    </w:rPr>
-                    <w:t xml:space="preserve">Geheimtextbuchstaben </w:t>
-                  </w:r>
-                  <w:r>
-                    <w:rPr>
-                      <w:rFonts w:ascii="Calibri" w:hAnsi="Calibri" w:cs="Calibri" w:eastAsia="Calibri"/>
-                      <w:b/>
-                      <w:i w:val="0"/>
-                      <w:color w:val="1B1B1F"/>
-                      <w:sz w:val="22"/>
-                    </w:rPr>
-                    <w:t>zählen</w:t>
-                  </w:r>
-                  <w:r>
-                    <w:rPr>
-                      <w:rFonts w:ascii="Calibri" w:hAnsi="Calibri" w:cs="Calibri" w:eastAsia="Calibri"/>
-                      <w:b w:val="0"/>
-                      <w:i w:val="0"/>
-                      <w:color w:val="1B1B1F"/>
-                      <w:sz w:val="22"/>
-                    </w:rPr>
-                    <w:t xml:space="preserve"> und nach Häufigkeit ordnen.</w:t>
-                  </w:r>
-                </w:p>
-                <w:p>
-                  <w:pPr>
-                    <w:tabs>
-                      <w:tab w:pos="397" w:val="left"/>
-                    </w:tabs>
-                    <w:spacing w:before="0" w:after="40"/>
-                    <w:ind w:left="397" w:hanging="283"/>
-                  </w:pPr>
-                  <w:r>
-                    <w:rPr>
-                      <w:rFonts w:ascii="Calibri" w:hAnsi="Calibri" w:cs="Calibri" w:eastAsia="Calibri"/>
-                      <w:b/>
-                      <w:color w:val="14213D"/>
-                      <w:sz w:val="22"/>
-                    </w:rPr>
-                    <w:t>2.</w:t>
-                    <w:tab/>
-                  </w:r>
-                  <w:r>
-                    <w:rPr>
-                      <w:rFonts w:ascii="Calibri" w:hAnsi="Calibri" w:cs="Calibri" w:eastAsia="Calibri"/>
-                      <w:b w:val="0"/>
-                      <w:i w:val="0"/>
-                      <w:color w:val="1B1B1F"/>
-                      <w:sz w:val="22"/>
-                    </w:rPr>
-                    <w:t xml:space="preserve">Häufigster Geheimtextbuchstabe ≙ </w:t>
-                  </w:r>
-                  <w:r>
-                    <w:rPr>
-                      <w:rFonts w:ascii="Calibri" w:hAnsi="Calibri" w:cs="Calibri" w:eastAsia="Calibri"/>
-                      <w:b/>
-                      <w:i w:val="0"/>
-                      <w:color w:val="1B1B1F"/>
-                      <w:sz w:val="22"/>
-                    </w:rPr>
-                    <w:t>e</w:t>
-                  </w:r>
-                  <w:r>
-                    <w:rPr>
-                      <w:rFonts w:ascii="Calibri" w:hAnsi="Calibri" w:cs="Calibri" w:eastAsia="Calibri"/>
-                      <w:b w:val="0"/>
-                      <w:i w:val="0"/>
-                      <w:color w:val="1B1B1F"/>
-                      <w:sz w:val="22"/>
-                    </w:rPr>
-                    <w:t>.</w:t>
-                  </w:r>
-                </w:p>
-                <w:p>
-                  <w:pPr>
-                    <w:tabs>
-                      <w:tab w:pos="397" w:val="left"/>
-                    </w:tabs>
-                    <w:spacing w:before="0" w:after="40"/>
-                    <w:ind w:left="397" w:hanging="283"/>
-                  </w:pPr>
-                  <w:r>
-                    <w:rPr>
-                      <w:rFonts w:ascii="Calibri" w:hAnsi="Calibri" w:cs="Calibri" w:eastAsia="Calibri"/>
-                      <w:b/>
-                      <w:color w:val="14213D"/>
-                      <w:sz w:val="22"/>
-                    </w:rPr>
-                    <w:t>3.</w:t>
-                    <w:tab/>
-                  </w:r>
-                  <w:r>
-                    <w:rPr>
-                      <w:rFonts w:ascii="Calibri" w:hAnsi="Calibri" w:cs="Calibri" w:eastAsia="Calibri"/>
-                      <w:b w:val="0"/>
-                      <w:i w:val="0"/>
-                      <w:color w:val="1B1B1F"/>
-                      <w:sz w:val="22"/>
-                    </w:rPr>
-                    <w:t xml:space="preserve">Weitere Kandidaten mit n, i, s, r, a, t vergleichen – aber </w:t>
-                  </w:r>
-                  <w:r>
-                    <w:rPr>
-                      <w:rFonts w:ascii="Calibri" w:hAnsi="Calibri" w:cs="Calibri" w:eastAsia="Calibri"/>
-                      <w:b/>
-                      <w:i w:val="0"/>
-                      <w:color w:val="1B1B1F"/>
-                      <w:sz w:val="22"/>
-                    </w:rPr>
-                    <w:t>nicht blind</w:t>
-                  </w:r>
-                  <w:r>
-                    <w:rPr>
-                      <w:rFonts w:ascii="Calibri" w:hAnsi="Calibri" w:cs="Calibri" w:eastAsia="Calibri"/>
-                      <w:b w:val="0"/>
-                      <w:i w:val="0"/>
-                      <w:color w:val="1B1B1F"/>
-                      <w:sz w:val="22"/>
-                    </w:rPr>
-                    <w:t xml:space="preserve"> zuordnen.</w:t>
-                  </w:r>
-                </w:p>
-                <w:p>
-                  <w:pPr>
-                    <w:tabs>
-                      <w:tab w:pos="397" w:val="left"/>
-                    </w:tabs>
-                    <w:spacing w:before="0" w:after="40"/>
-                    <w:ind w:left="397" w:hanging="283"/>
-                  </w:pPr>
-                  <w:r>
-                    <w:rPr>
-                      <w:rFonts w:ascii="Calibri" w:hAnsi="Calibri" w:cs="Calibri" w:eastAsia="Calibri"/>
-                      <w:b/>
-                      <w:color w:val="14213D"/>
-                      <w:sz w:val="22"/>
-                    </w:rPr>
-                    <w:t>4.</w:t>
-                    <w:tab/>
-                  </w:r>
-                  <w:r>
-                    <w:rPr>
-                      <w:rFonts w:ascii="Calibri" w:hAnsi="Calibri" w:cs="Calibri" w:eastAsia="Calibri"/>
-                      <w:b/>
-                      <w:i w:val="0"/>
-                      <w:color w:val="1B1B1F"/>
-                      <w:sz w:val="22"/>
-                    </w:rPr>
-                    <w:t>Bigramme</w:t>
-                  </w:r>
-                  <w:r>
-                    <w:rPr>
-                      <w:rFonts w:ascii="Calibri" w:hAnsi="Calibri" w:cs="Calibri" w:eastAsia="Calibri"/>
-                      <w:b w:val="0"/>
-                      <w:i w:val="0"/>
-                      <w:color w:val="1B1B1F"/>
-                      <w:sz w:val="22"/>
-                    </w:rPr>
-                    <w:t xml:space="preserve"> und </w:t>
-                  </w:r>
-                  <w:r>
-                    <w:rPr>
-                      <w:rFonts w:ascii="Calibri" w:hAnsi="Calibri" w:cs="Calibri" w:eastAsia="Calibri"/>
-                      <w:b/>
-                      <w:i w:val="0"/>
-                      <w:color w:val="1B1B1F"/>
-                      <w:sz w:val="22"/>
-                    </w:rPr>
-                    <w:t>Muster</w:t>
-                  </w:r>
-                  <w:r>
-                    <w:rPr>
-                      <w:rFonts w:ascii="Calibri" w:hAnsi="Calibri" w:cs="Calibri" w:eastAsia="Calibri"/>
-                      <w:b w:val="0"/>
-                      <w:i w:val="0"/>
-                      <w:color w:val="1B1B1F"/>
-                      <w:sz w:val="22"/>
-                    </w:rPr>
-                    <w:t xml:space="preserve"> nutzen (Archivwissen 4).</w:t>
-                  </w:r>
-                </w:p>
-                <w:p>
-                  <w:pPr>
-                    <w:tabs>
-                      <w:tab w:pos="397" w:val="left"/>
-                    </w:tabs>
-                    <w:spacing w:before="0" w:after="40"/>
-                    <w:ind w:left="397" w:hanging="283"/>
-                  </w:pPr>
-                  <w:r>
-                    <w:rPr>
-                      <w:rFonts w:ascii="Calibri" w:hAnsi="Calibri" w:cs="Calibri" w:eastAsia="Calibri"/>
-                      <w:b/>
-                      <w:color w:val="14213D"/>
-                      <w:sz w:val="22"/>
-                    </w:rPr>
-                    <w:t>5.</w:t>
-                    <w:tab/>
-                  </w:r>
-                  <w:r>
-                    <w:rPr>
-                      <w:rFonts w:ascii="Calibri" w:hAnsi="Calibri" w:cs="Calibri" w:eastAsia="Calibri"/>
-                      <w:b w:val="0"/>
-                      <w:i w:val="0"/>
-                      <w:color w:val="1B1B1F"/>
-                      <w:sz w:val="22"/>
-                    </w:rPr>
-                    <w:t xml:space="preserve">Teilweise entschlüsselten Text </w:t>
-                  </w:r>
-                  <w:r>
-                    <w:rPr>
-                      <w:rFonts w:ascii="Calibri" w:hAnsi="Calibri" w:cs="Calibri" w:eastAsia="Calibri"/>
-                      <w:b/>
-                      <w:i w:val="0"/>
-                      <w:color w:val="1B1B1F"/>
-                      <w:sz w:val="22"/>
-                    </w:rPr>
-                    <w:t>lesen</w:t>
-                  </w:r>
-                  <w:r>
-                    <w:rPr>
-                      <w:rFonts w:ascii="Calibri" w:hAnsi="Calibri" w:cs="Calibri" w:eastAsia="Calibri"/>
-                      <w:b w:val="0"/>
-                      <w:i w:val="0"/>
-                      <w:color w:val="1B1B1F"/>
-                      <w:sz w:val="22"/>
-                    </w:rPr>
-                    <w:t>, Wörter ergänzen, Zuordnung verbessern.</w:t>
-                  </w:r>
-                </w:p>
-              </w:tc>
-            </w:tr>
-          </w:tbl>
-          <w:p/>
+          <w:p>
+            <w:pPr>
+              <w:spacing w:before="40" w:after="80"/>
+              <w:jc w:val="center"/>
+            </w:pPr>
+            <w:r>
+              <w:drawing>
+                <wp:inline xmlns:a="http://schemas.openxmlformats.org/drawingml/2006/main" xmlns:pic="http://schemas.openxmlformats.org/drawingml/2006/picture">
+                  <wp:extent cx="5832000" cy="2099520"/>
+                  <wp:docPr id="2" name="Picture 2"/>
+                  <wp:cNvGraphicFramePr>
+                    <a:graphicFrameLocks noChangeAspect="1"/>
+                  </wp:cNvGraphicFramePr>
+                  <a:graphic>
+                    <a:graphicData uri="http://schemas.openxmlformats.org/drawingml/2006/picture">
+                      <pic:pic>
+                        <pic:nvPicPr>
+                          <pic:cNvPr id="0" name="haeufigkeit_66658cb372211e19.png"/>
+                          <pic:cNvPicPr/>
+                        </pic:nvPicPr>
+                        <pic:blipFill>
+                          <a:blip r:embed="rId10"/>
+                          <a:stretch>
+                            <a:fillRect/>
+                          </a:stretch>
+                        </pic:blipFill>
+                        <pic:spPr>
+                          <a:xfrm>
+                            <a:off x="0" y="0"/>
+                            <a:ext cx="5832000" cy="2099520"/>
+                          </a:xfrm>
+                          <a:prstGeom prst="rect"/>
+                        </pic:spPr>
+                      </pic:pic>
+                    </a:graphicData>
+                  </a:graphic>
+                </wp:inline>
+              </w:drawing>
+            </w:r>
+          </w:p>
+          <w:p>
+            <w:pPr>
+              <w:spacing w:before="0" w:after="80"/>
+            </w:pPr>
+            <w:r>
+              <w:rPr>
+                <w:rFonts w:ascii="Calibri" w:hAnsi="Calibri" w:cs="Calibri" w:eastAsia="Calibri"/>
+                <w:b/>
+                <w:i w:val="0"/>
+                <w:color w:val="1B1B1F"/>
+                <w:sz w:val="22"/>
+              </w:rPr>
+              <w:t>Vorgehen:</w:t>
+            </w:r>
+          </w:p>
+          <w:p>
+            <w:pPr>
+              <w:tabs>
+                <w:tab w:pos="397" w:val="left"/>
+              </w:tabs>
+              <w:spacing w:before="0" w:after="40"/>
+              <w:ind w:left="397" w:hanging="283"/>
+            </w:pPr>
+            <w:r>
+              <w:rPr>
+                <w:rFonts w:ascii="Calibri" w:hAnsi="Calibri" w:cs="Calibri" w:eastAsia="Calibri"/>
+                <w:b/>
+                <w:color w:val="14213D"/>
+                <w:sz w:val="22"/>
+              </w:rPr>
+              <w:t>1.</w:t>
+              <w:tab/>
+            </w:r>
+            <w:r>
+              <w:rPr>
+                <w:rFonts w:ascii="Calibri" w:hAnsi="Calibri" w:cs="Calibri" w:eastAsia="Calibri"/>
+                <w:b w:val="0"/>
+                <w:i w:val="0"/>
+                <w:color w:val="1B1B1F"/>
+                <w:sz w:val="22"/>
+              </w:rPr>
+              <w:t xml:space="preserve">Geheimtextbuchstaben </w:t>
+            </w:r>
+            <w:r>
+              <w:rPr>
+                <w:rFonts w:ascii="Calibri" w:hAnsi="Calibri" w:cs="Calibri" w:eastAsia="Calibri"/>
+                <w:b/>
+                <w:i w:val="0"/>
+                <w:color w:val="1B1B1F"/>
+                <w:sz w:val="22"/>
+              </w:rPr>
+              <w:t>zählen</w:t>
+            </w:r>
+            <w:r>
+              <w:rPr>
+                <w:rFonts w:ascii="Calibri" w:hAnsi="Calibri" w:cs="Calibri" w:eastAsia="Calibri"/>
+                <w:b w:val="0"/>
+                <w:i w:val="0"/>
+                <w:color w:val="1B1B1F"/>
+                <w:sz w:val="22"/>
+              </w:rPr>
+              <w:t xml:space="preserve"> und nach Häufigkeit ordnen.</w:t>
+            </w:r>
+          </w:p>
+          <w:p>
+            <w:pPr>
+              <w:tabs>
+                <w:tab w:pos="397" w:val="left"/>
+              </w:tabs>
+              <w:spacing w:before="0" w:after="40"/>
+              <w:ind w:left="397" w:hanging="283"/>
+            </w:pPr>
+            <w:r>
+              <w:rPr>
+                <w:rFonts w:ascii="Calibri" w:hAnsi="Calibri" w:cs="Calibri" w:eastAsia="Calibri"/>
+                <w:b/>
+                <w:color w:val="14213D"/>
+                <w:sz w:val="22"/>
+              </w:rPr>
+              <w:t>2.</w:t>
+              <w:tab/>
+            </w:r>
+            <w:r>
+              <w:rPr>
+                <w:rFonts w:ascii="Calibri" w:hAnsi="Calibri" w:cs="Calibri" w:eastAsia="Calibri"/>
+                <w:b w:val="0"/>
+                <w:i w:val="0"/>
+                <w:color w:val="1B1B1F"/>
+                <w:sz w:val="22"/>
+              </w:rPr>
+              <w:t xml:space="preserve">Häufigster Geheimtextbuchstabe ≙ </w:t>
+            </w:r>
+            <w:r>
+              <w:rPr>
+                <w:rFonts w:ascii="Calibri" w:hAnsi="Calibri" w:cs="Calibri" w:eastAsia="Calibri"/>
+                <w:b/>
+                <w:i w:val="0"/>
+                <w:color w:val="1B1B1F"/>
+                <w:sz w:val="22"/>
+              </w:rPr>
+              <w:t>e</w:t>
+            </w:r>
+            <w:r>
+              <w:rPr>
+                <w:rFonts w:ascii="Calibri" w:hAnsi="Calibri" w:cs="Calibri" w:eastAsia="Calibri"/>
+                <w:b w:val="0"/>
+                <w:i w:val="0"/>
+                <w:color w:val="1B1B1F"/>
+                <w:sz w:val="22"/>
+              </w:rPr>
+              <w:t>.</w:t>
+            </w:r>
+          </w:p>
+          <w:p>
+            <w:pPr>
+              <w:tabs>
+                <w:tab w:pos="397" w:val="left"/>
+              </w:tabs>
+              <w:spacing w:before="0" w:after="40"/>
+              <w:ind w:left="397" w:hanging="283"/>
+            </w:pPr>
+            <w:r>
+              <w:rPr>
+                <w:rFonts w:ascii="Calibri" w:hAnsi="Calibri" w:cs="Calibri" w:eastAsia="Calibri"/>
+                <w:b/>
+                <w:color w:val="14213D"/>
+                <w:sz w:val="22"/>
+              </w:rPr>
+              <w:t>3.</w:t>
+              <w:tab/>
+            </w:r>
+            <w:r>
+              <w:rPr>
+                <w:rFonts w:ascii="Calibri" w:hAnsi="Calibri" w:cs="Calibri" w:eastAsia="Calibri"/>
+                <w:b w:val="0"/>
+                <w:i w:val="0"/>
+                <w:color w:val="1B1B1F"/>
+                <w:sz w:val="22"/>
+              </w:rPr>
+              <w:t xml:space="preserve">Weitere Kandidaten mit n, i, s, r, a, t vergleichen – aber </w:t>
+            </w:r>
+            <w:r>
+              <w:rPr>
+                <w:rFonts w:ascii="Calibri" w:hAnsi="Calibri" w:cs="Calibri" w:eastAsia="Calibri"/>
+                <w:b/>
+                <w:i w:val="0"/>
+                <w:color w:val="1B1B1F"/>
+                <w:sz w:val="22"/>
+              </w:rPr>
+              <w:t>nicht blind</w:t>
+            </w:r>
+            <w:r>
+              <w:rPr>
+                <w:rFonts w:ascii="Calibri" w:hAnsi="Calibri" w:cs="Calibri" w:eastAsia="Calibri"/>
+                <w:b w:val="0"/>
+                <w:i w:val="0"/>
+                <w:color w:val="1B1B1F"/>
+                <w:sz w:val="22"/>
+              </w:rPr>
+              <w:t xml:space="preserve"> zuordnen.</w:t>
+            </w:r>
+          </w:p>
+          <w:p>
+            <w:pPr>
+              <w:tabs>
+                <w:tab w:pos="397" w:val="left"/>
+              </w:tabs>
+              <w:spacing w:before="0" w:after="40"/>
+              <w:ind w:left="397" w:hanging="283"/>
+            </w:pPr>
+            <w:r>
+              <w:rPr>
+                <w:rFonts w:ascii="Calibri" w:hAnsi="Calibri" w:cs="Calibri" w:eastAsia="Calibri"/>
+                <w:b/>
+                <w:color w:val="14213D"/>
+                <w:sz w:val="22"/>
+              </w:rPr>
+              <w:t>4.</w:t>
+              <w:tab/>
+            </w:r>
+            <w:r>
+              <w:rPr>
+                <w:rFonts w:ascii="Calibri" w:hAnsi="Calibri" w:cs="Calibri" w:eastAsia="Calibri"/>
+                <w:b/>
+                <w:i w:val="0"/>
+                <w:color w:val="1B1B1F"/>
+                <w:sz w:val="22"/>
+              </w:rPr>
+              <w:t>Bigramme</w:t>
+            </w:r>
+            <w:r>
+              <w:rPr>
+                <w:rFonts w:ascii="Calibri" w:hAnsi="Calibri" w:cs="Calibri" w:eastAsia="Calibri"/>
+                <w:b w:val="0"/>
+                <w:i w:val="0"/>
+                <w:color w:val="1B1B1F"/>
+                <w:sz w:val="22"/>
+              </w:rPr>
+              <w:t xml:space="preserve"> und </w:t>
+            </w:r>
+            <w:r>
+              <w:rPr>
+                <w:rFonts w:ascii="Calibri" w:hAnsi="Calibri" w:cs="Calibri" w:eastAsia="Calibri"/>
+                <w:b/>
+                <w:i w:val="0"/>
+                <w:color w:val="1B1B1F"/>
+                <w:sz w:val="22"/>
+              </w:rPr>
+              <w:t>Muster</w:t>
+            </w:r>
+            <w:r>
+              <w:rPr>
+                <w:rFonts w:ascii="Calibri" w:hAnsi="Calibri" w:cs="Calibri" w:eastAsia="Calibri"/>
+                <w:b w:val="0"/>
+                <w:i w:val="0"/>
+                <w:color w:val="1B1B1F"/>
+                <w:sz w:val="22"/>
+              </w:rPr>
+              <w:t xml:space="preserve"> nutzen (Archivwissen 4).</w:t>
+            </w:r>
+          </w:p>
+          <w:p>
+            <w:pPr>
+              <w:tabs>
+                <w:tab w:pos="397" w:val="left"/>
+              </w:tabs>
+              <w:spacing w:before="0" w:after="40"/>
+              <w:ind w:left="397" w:hanging="283"/>
+            </w:pPr>
+            <w:r>
+              <w:rPr>
+                <w:rFonts w:ascii="Calibri" w:hAnsi="Calibri" w:cs="Calibri" w:eastAsia="Calibri"/>
+                <w:b/>
+                <w:color w:val="14213D"/>
+                <w:sz w:val="22"/>
+              </w:rPr>
+              <w:t>5.</w:t>
+              <w:tab/>
+            </w:r>
+            <w:r>
+              <w:rPr>
+                <w:rFonts w:ascii="Calibri" w:hAnsi="Calibri" w:cs="Calibri" w:eastAsia="Calibri"/>
+                <w:b w:val="0"/>
+                <w:i w:val="0"/>
+                <w:color w:val="1B1B1F"/>
+                <w:sz w:val="22"/>
+              </w:rPr>
+              <w:t xml:space="preserve">Teilweise entschlüsselten Text </w:t>
+            </w:r>
+            <w:r>
+              <w:rPr>
+                <w:rFonts w:ascii="Calibri" w:hAnsi="Calibri" w:cs="Calibri" w:eastAsia="Calibri"/>
+                <w:b/>
+                <w:i w:val="0"/>
+                <w:color w:val="1B1B1F"/>
+                <w:sz w:val="22"/>
+              </w:rPr>
+              <w:t>lesen</w:t>
+            </w:r>
+            <w:r>
+              <w:rPr>
+                <w:rFonts w:ascii="Calibri" w:hAnsi="Calibri" w:cs="Calibri" w:eastAsia="Calibri"/>
+                <w:b w:val="0"/>
+                <w:i w:val="0"/>
+                <w:color w:val="1B1B1F"/>
+                <w:sz w:val="22"/>
+              </w:rPr>
+              <w:t>, Wörter ergänzen, Zuordnung verbessern.</w:t>
+            </w:r>
+          </w:p>
           <w:p>
             <w:pPr>
               <w:spacing w:before="0" w:after="80"/>
@@ -7947,7 +7893,7 @@
       <w:r>
         <w:drawing>
           <wp:inline xmlns:a="http://schemas.openxmlformats.org/drawingml/2006/main" xmlns:pic="http://schemas.openxmlformats.org/drawingml/2006/picture">
-            <wp:extent cx="6048000" cy="1995840"/>
+            <wp:extent cx="6048000" cy="2177280"/>
             <wp:docPr id="3" name="Picture 3"/>
             <wp:cNvGraphicFramePr>
               <a:graphicFrameLocks noChangeAspect="1"/>
@@ -7956,7 +7902,7 @@
               <a:graphicData uri="http://schemas.openxmlformats.org/drawingml/2006/picture">
                 <pic:pic>
                   <pic:nvPicPr>
-                    <pic:cNvPr id="0" name="haeufigkeit_b7484fd57a93770e.png"/>
+                    <pic:cNvPr id="0" name="haeufigkeit_798cad0bb3ae2c91.png"/>
                     <pic:cNvPicPr/>
                   </pic:nvPicPr>
                   <pic:blipFill>
@@ -7968,7 +7914,7 @@
                   <pic:spPr>
                     <a:xfrm>
                       <a:off x="0" y="0"/>
-                      <a:ext cx="6048000" cy="1995840"/>
+                      <a:ext cx="6048000" cy="2177280"/>
                     </a:xfrm>
                     <a:prstGeom prst="rect"/>
                   </pic:spPr>

</xml_diff>